<commit_message>
Vault Backup 2026-05-01 10:36:33
</commit_message>
<xml_diff>
--- a/Projects/Landscaping/plant_shopping_list_v3.docx
+++ b/Projects/Landscaping/plant_shopping_list_v3.docx
@@ -167,12 +167,6 @@
         <w:gridCol w:w="3614"/>
       </w:tblGrid>
       <w:tr>
-        <w:tblPrEx>
-          <w:tblCellMar>
-            <w:top w:w="0" w:type="dxa"/>
-            <w:bottom w:w="0" w:type="dxa"/>
-          </w:tblCellMar>
-        </w:tblPrEx>
         <w:trPr>
           <w:tblHeader/>
         </w:trPr>
@@ -328,12 +322,6 @@
         </w:tc>
       </w:tr>
       <w:tr>
-        <w:tblPrEx>
-          <w:tblCellMar>
-            <w:top w:w="0" w:type="dxa"/>
-            <w:bottom w:w="0" w:type="dxa"/>
-          </w:tblCellMar>
-        </w:tblPrEx>
         <w:tc>
           <w:tcPr>
             <w:tcW w:w="9360" w:type="dxa"/>
@@ -395,12 +383,6 @@
         </w:tc>
       </w:tr>
       <w:tr>
-        <w:tblPrEx>
-          <w:tblCellMar>
-            <w:top w:w="0" w:type="dxa"/>
-            <w:bottom w:w="0" w:type="dxa"/>
-          </w:tblCellMar>
-        </w:tblPrEx>
         <w:tc>
           <w:tcPr>
             <w:tcW w:w="2880" w:type="dxa"/>
@@ -537,12 +519,6 @@
         </w:tc>
       </w:tr>
       <w:tr>
-        <w:tblPrEx>
-          <w:tblCellMar>
-            <w:top w:w="0" w:type="dxa"/>
-            <w:bottom w:w="0" w:type="dxa"/>
-          </w:tblCellMar>
-        </w:tblPrEx>
         <w:tc>
           <w:tcPr>
             <w:tcW w:w="2880" w:type="dxa"/>
@@ -690,12 +666,6 @@
         </w:tc>
       </w:tr>
       <w:tr>
-        <w:tblPrEx>
-          <w:tblCellMar>
-            <w:top w:w="0" w:type="dxa"/>
-            <w:bottom w:w="0" w:type="dxa"/>
-          </w:tblCellMar>
-        </w:tblPrEx>
         <w:tc>
           <w:tcPr>
             <w:tcW w:w="2880" w:type="dxa"/>
@@ -852,12 +822,6 @@
         </w:tc>
       </w:tr>
       <w:tr>
-        <w:tblPrEx>
-          <w:tblCellMar>
-            <w:top w:w="0" w:type="dxa"/>
-            <w:bottom w:w="0" w:type="dxa"/>
-          </w:tblCellMar>
-        </w:tblPrEx>
         <w:tc>
           <w:tcPr>
             <w:tcW w:w="9360" w:type="dxa"/>
@@ -893,12 +857,6 @@
         </w:tc>
       </w:tr>
       <w:tr>
-        <w:tblPrEx>
-          <w:tblCellMar>
-            <w:top w:w="0" w:type="dxa"/>
-            <w:bottom w:w="0" w:type="dxa"/>
-          </w:tblCellMar>
-        </w:tblPrEx>
         <w:tc>
           <w:tcPr>
             <w:tcW w:w="2880" w:type="dxa"/>
@@ -1106,12 +1064,6 @@
         </w:tc>
       </w:tr>
       <w:tr>
-        <w:tblPrEx>
-          <w:tblCellMar>
-            <w:top w:w="0" w:type="dxa"/>
-            <w:bottom w:w="0" w:type="dxa"/>
-          </w:tblCellMar>
-        </w:tblPrEx>
         <w:tc>
           <w:tcPr>
             <w:tcW w:w="2880" w:type="dxa"/>
@@ -1248,12 +1200,6 @@
         </w:tc>
       </w:tr>
       <w:tr>
-        <w:tblPrEx>
-          <w:tblCellMar>
-            <w:top w:w="0" w:type="dxa"/>
-            <w:bottom w:w="0" w:type="dxa"/>
-          </w:tblCellMar>
-        </w:tblPrEx>
         <w:tc>
           <w:tcPr>
             <w:tcW w:w="9360" w:type="dxa"/>
@@ -1289,12 +1235,6 @@
         </w:tc>
       </w:tr>
       <w:tr>
-        <w:tblPrEx>
-          <w:tblCellMar>
-            <w:top w:w="0" w:type="dxa"/>
-            <w:bottom w:w="0" w:type="dxa"/>
-          </w:tblCellMar>
-        </w:tblPrEx>
         <w:tc>
           <w:tcPr>
             <w:tcW w:w="2880" w:type="dxa"/>
@@ -1482,12 +1422,6 @@
         </w:tc>
       </w:tr>
       <w:tr>
-        <w:tblPrEx>
-          <w:tblCellMar>
-            <w:top w:w="0" w:type="dxa"/>
-            <w:bottom w:w="0" w:type="dxa"/>
-          </w:tblCellMar>
-        </w:tblPrEx>
         <w:tc>
           <w:tcPr>
             <w:tcW w:w="2880" w:type="dxa"/>
@@ -1664,12 +1598,6 @@
         </w:tc>
       </w:tr>
       <w:tr>
-        <w:tblPrEx>
-          <w:tblCellMar>
-            <w:top w:w="0" w:type="dxa"/>
-            <w:bottom w:w="0" w:type="dxa"/>
-          </w:tblCellMar>
-        </w:tblPrEx>
         <w:tc>
           <w:tcPr>
             <w:tcW w:w="9360" w:type="dxa"/>
@@ -1705,12 +1633,6 @@
         </w:tc>
       </w:tr>
       <w:tr>
-        <w:tblPrEx>
-          <w:tblCellMar>
-            <w:top w:w="0" w:type="dxa"/>
-            <w:bottom w:w="0" w:type="dxa"/>
-          </w:tblCellMar>
-        </w:tblPrEx>
         <w:tc>
           <w:tcPr>
             <w:tcW w:w="2880" w:type="dxa"/>
@@ -1952,12 +1874,6 @@
         </w:tc>
       </w:tr>
       <w:tr>
-        <w:tblPrEx>
-          <w:tblCellMar>
-            <w:top w:w="0" w:type="dxa"/>
-            <w:bottom w:w="0" w:type="dxa"/>
-          </w:tblCellMar>
-        </w:tblPrEx>
         <w:tc>
           <w:tcPr>
             <w:tcW w:w="2880" w:type="dxa"/>
@@ -2119,12 +2035,6 @@
         </w:tc>
       </w:tr>
       <w:tr>
-        <w:tblPrEx>
-          <w:tblCellMar>
-            <w:top w:w="0" w:type="dxa"/>
-            <w:bottom w:w="0" w:type="dxa"/>
-          </w:tblCellMar>
-        </w:tblPrEx>
         <w:tc>
           <w:tcPr>
             <w:tcW w:w="3480" w:type="dxa"/>

</xml_diff>